<commit_message>
Upload the whole Papyrus file
</commit_message>
<xml_diff>
--- a/docs/Cover_G02.docx
+++ b/docs/Cover_G02.docx
@@ -65,6 +65,15 @@
             </a:graphic>
           </wp:anchor>
         </w:drawing>
+      </w:r>
+      <w:r>
+        <w:rPr>
+          <w:rFonts w:ascii="Arial" w:eastAsia="Arial" w:hAnsi="Arial" w:cs="Arial"/>
+          <w:b/>
+          <w:sz w:val="42"/>
+          <w:szCs w:val="42"/>
+        </w:rPr>
+        <w:t xml:space="preserve"> </w:t>
       </w:r>
       <w:r>
         <w:rPr>
@@ -1980,6 +1989,24 @@
                 <w:szCs w:val="22"/>
               </w:rPr>
               <w:t>Marlo</w:t>
+            </w:r>
+            <w:r>
+              <w:rPr>
+                <w:rFonts w:ascii="Arial" w:eastAsia="Arial" w:hAnsi="Arial" w:cs="Arial"/>
+                <w:b/>
+                <w:sz w:val="22"/>
+                <w:szCs w:val="22"/>
+              </w:rPr>
+              <w:t xml:space="preserve"> </w:t>
+            </w:r>
+            <w:r>
+              <w:rPr>
+                <w:rFonts w:ascii="Arial" w:eastAsia="Arial" w:hAnsi="Arial" w:cs="Arial"/>
+                <w:b/>
+                <w:sz w:val="22"/>
+                <w:szCs w:val="22"/>
+              </w:rPr>
+              <w:t>Serfaty</w:t>
             </w:r>
           </w:p>
         </w:tc>

</xml_diff>